<commit_message>
Alinear el laboratorio y la documentación al temario CISA (PPT Central de Ingenios, fechas 11 y 25 de septiembre, casos Planta Central).
Co-authored-by: Cursor <cursoragent@cursor.com>
</commit_message>
<xml_diff>
--- a/Correo-de-Bienvenida.docx
+++ b/Correo-de-Bienvenida.docx
@@ -71,7 +71,7 @@
         <w:spacing w:after="120"/>
       </w:pPr>
       <w:r>
-        <w:t xml:space="preserve">Nos alegra acompañarlos en el curso de Inteligencia Artificial Aplicada al Negocio (ChatGPT y Claude), de 16 horas, que se realizará los días [FECHAS] en [LUGAR], en horario de [HORA].</w:t>
+        <w:t xml:space="preserve">Nos alegra acompañarlos en el curso de Inteligencia Artificial Aplicada al Negocio (ChatGPT y Claude), de 16 horas, los viernes 11 y 25 de septiembre de 2026, en [LUGAR], en horario de [HORA].</w:t>
       </w:r>
     </w:p>
     <w:p>
@@ -97,7 +97,7 @@
         <w:spacing w:after="80"/>
       </w:pPr>
       <w:r>
-        <w:t xml:space="preserve">Crear una cuenta gratuita de ChatGPT (chat.openai.com) y una de Claude (claude.ai).</w:t>
+        <w:t xml:space="preserve">Crear una cuenta gratuita de ChatGPT (chatgpt.com) y una de Claude (claude.ai).</w:t>
       </w:r>
     </w:p>
     <w:p>
@@ -176,7 +176,7 @@
         <w:rPr>
           <w:b/>
         </w:rPr>
-        <w:t xml:space="preserve">Equipo MagnaTic · Think Evolution</w:t>
+        <w:t xml:space="preserve">Equipo Magnatic · Think Evolution</w:t>
       </w:r>
     </w:p>
     <w:sectPr>

</xml_diff>